<commit_message>
Renamed all phases with descriptions
</commit_message>
<xml_diff>
--- a/Phase3 - Data Preprocessing/Preprocessing_Phase3.docx
+++ b/Phase3 - Data Preprocessing/Preprocessing_Phase3.docx
@@ -2191,10 +2191,9 @@
         <w:rPr>
           <w:noProof/>
         </w:rPr>
-        <w:lastRenderedPageBreak/>
         <w:drawing>
-          <wp:inline distT="0" distB="0" distL="0" distR="0" wp14:anchorId="4D7FE3F7" wp14:editId="3E594E6D">
-            <wp:extent cx="6123940" cy="2616200"/>
+          <wp:inline distT="0" distB="0" distL="0" distR="0" wp14:anchorId="4D7FE3F7" wp14:editId="761C1A36">
+            <wp:extent cx="6123940" cy="2179320"/>
             <wp:effectExtent l="0" t="0" r="0" b="0"/>
             <wp:docPr id="6642739" name="Picture 1"/>
             <wp:cNvGraphicFramePr>
@@ -2216,7 +2215,7 @@
                   <pic:spPr>
                     <a:xfrm>
                       <a:off x="0" y="0"/>
-                      <a:ext cx="6123940" cy="2616200"/>
+                      <a:ext cx="6123940" cy="2179320"/>
                     </a:xfrm>
                     <a:prstGeom prst="rect">
                       <a:avLst/>
@@ -2254,6 +2253,7 @@
           <w:color w:val="1E1E1E"/>
           <w:sz w:val="24"/>
         </w:rPr>
+        <w:lastRenderedPageBreak/>
         <w:t xml:space="preserve"> </w:t>
       </w:r>
     </w:p>
@@ -2656,12 +2656,11 @@
         <w:rPr>
           <w:noProof/>
         </w:rPr>
-        <w:lastRenderedPageBreak/>
         <w:drawing>
-          <wp:inline distT="0" distB="0" distL="0" distR="0" wp14:anchorId="2D66A8A6" wp14:editId="5660B4E1">
-            <wp:extent cx="6123940" cy="1124585"/>
+          <wp:inline distT="0" distB="0" distL="0" distR="0" wp14:anchorId="507E06F5" wp14:editId="23A793CB">
+            <wp:extent cx="6123940" cy="1834515"/>
             <wp:effectExtent l="0" t="0" r="0" b="0"/>
-            <wp:docPr id="649436178" name="Picture 1"/>
+            <wp:docPr id="1377759724" name="Picture 1"/>
             <wp:cNvGraphicFramePr>
               <a:graphicFrameLocks xmlns:a="http://schemas.openxmlformats.org/drawingml/2006/main" noChangeAspect="1"/>
             </wp:cNvGraphicFramePr>
@@ -2669,7 +2668,7 @@
               <a:graphicData uri="http://schemas.openxmlformats.org/drawingml/2006/picture">
                 <pic:pic xmlns:pic="http://schemas.openxmlformats.org/drawingml/2006/picture">
                   <pic:nvPicPr>
-                    <pic:cNvPr id="649436178" name=""/>
+                    <pic:cNvPr id="1377759724" name=""/>
                     <pic:cNvPicPr/>
                   </pic:nvPicPr>
                   <pic:blipFill>
@@ -2681,7 +2680,7 @@
                   <pic:spPr>
                     <a:xfrm>
                       <a:off x="0" y="0"/>
-                      <a:ext cx="6123940" cy="1124585"/>
+                      <a:ext cx="6123940" cy="1834515"/>
                     </a:xfrm>
                     <a:prstGeom prst="rect">
                       <a:avLst/>
@@ -2892,6 +2891,7 @@
         <w:rPr>
           <w:noProof/>
         </w:rPr>
+        <w:lastRenderedPageBreak/>
         <w:drawing>
           <wp:inline distT="0" distB="0" distL="0" distR="0" wp14:anchorId="54751B13" wp14:editId="1816BFBE">
             <wp:extent cx="6123940" cy="3637280"/>
@@ -2977,67 +2977,6 @@
     <w:p>
       <w:pPr>
         <w:spacing w:after="0"/>
-        <w:ind w:left="152" w:hanging="10"/>
-        <w:rPr>
-          <w:rFonts w:ascii="Times New Roman" w:eastAsia="Times New Roman" w:hAnsi="Times New Roman" w:cs="Times New Roman"/>
-          <w:b/>
-          <w:color w:val="273138"/>
-          <w:sz w:val="24"/>
-        </w:rPr>
-      </w:pPr>
-    </w:p>
-    <w:p>
-      <w:pPr>
-        <w:spacing w:after="0"/>
-        <w:ind w:left="152" w:hanging="10"/>
-        <w:rPr>
-          <w:rFonts w:ascii="Times New Roman" w:eastAsia="Times New Roman" w:hAnsi="Times New Roman" w:cs="Times New Roman"/>
-          <w:b/>
-          <w:color w:val="273138"/>
-          <w:sz w:val="24"/>
-        </w:rPr>
-      </w:pPr>
-    </w:p>
-    <w:p>
-      <w:pPr>
-        <w:spacing w:after="0"/>
-        <w:ind w:left="152" w:hanging="10"/>
-        <w:rPr>
-          <w:rFonts w:ascii="Times New Roman" w:eastAsia="Times New Roman" w:hAnsi="Times New Roman" w:cs="Times New Roman"/>
-          <w:b/>
-          <w:color w:val="273138"/>
-          <w:sz w:val="24"/>
-        </w:rPr>
-      </w:pPr>
-    </w:p>
-    <w:p>
-      <w:pPr>
-        <w:spacing w:after="0"/>
-        <w:ind w:left="152" w:hanging="10"/>
-        <w:rPr>
-          <w:rFonts w:ascii="Times New Roman" w:eastAsia="Times New Roman" w:hAnsi="Times New Roman" w:cs="Times New Roman"/>
-          <w:b/>
-          <w:color w:val="273138"/>
-          <w:sz w:val="24"/>
-        </w:rPr>
-      </w:pPr>
-    </w:p>
-    <w:p>
-      <w:pPr>
-        <w:spacing w:after="0"/>
-        <w:ind w:left="152" w:hanging="10"/>
-        <w:rPr>
-          <w:rFonts w:ascii="Times New Roman" w:eastAsia="Times New Roman" w:hAnsi="Times New Roman" w:cs="Times New Roman"/>
-          <w:b/>
-          <w:color w:val="273138"/>
-          <w:sz w:val="24"/>
-        </w:rPr>
-      </w:pPr>
-    </w:p>
-    <w:p>
-      <w:pPr>
-        <w:spacing w:after="0"/>
-        <w:ind w:left="152" w:hanging="10"/>
       </w:pPr>
       <w:r>
         <w:rPr>
@@ -3104,7 +3043,6 @@
         <w:rPr>
           <w:noProof/>
         </w:rPr>
-        <w:lastRenderedPageBreak/>
         <w:drawing>
           <wp:inline distT="0" distB="0" distL="0" distR="0" wp14:anchorId="690A7591" wp14:editId="514D1C8F">
             <wp:extent cx="6123940" cy="3640455"/>
@@ -3159,6 +3097,7 @@
         <w:rPr>
           <w:color w:val="273138"/>
         </w:rPr>
+        <w:lastRenderedPageBreak/>
         <w:t>missingno.bar</w:t>
       </w:r>
       <w:proofErr w:type="spellEnd"/>
@@ -3405,7 +3344,6 @@
           <w:color w:val="212121"/>
           <w:sz w:val="24"/>
         </w:rPr>
-        <w:lastRenderedPageBreak/>
         <w:t>2.Replacing with an arbitrary value:</w:t>
       </w:r>
       <w:r>
@@ -3461,9 +3399,9 @@
           <w:noProof/>
         </w:rPr>
         <w:drawing>
-          <wp:inline distT="0" distB="0" distL="0" distR="0" wp14:anchorId="2673F830" wp14:editId="613E003E">
-            <wp:extent cx="6123940" cy="3575685"/>
-            <wp:effectExtent l="0" t="0" r="0" b="5715"/>
+          <wp:inline distT="0" distB="0" distL="0" distR="0" wp14:anchorId="2673F830" wp14:editId="1247E922">
+            <wp:extent cx="6123940" cy="2865120"/>
+            <wp:effectExtent l="0" t="0" r="0" b="0"/>
             <wp:docPr id="1930945566" name="Picture 1"/>
             <wp:cNvGraphicFramePr>
               <a:graphicFrameLocks xmlns:a="http://schemas.openxmlformats.org/drawingml/2006/main" noChangeAspect="1"/>
@@ -3484,7 +3422,7 @@
                   <pic:spPr>
                     <a:xfrm>
                       <a:off x="0" y="0"/>
-                      <a:ext cx="6123940" cy="3575685"/>
+                      <a:ext cx="6123940" cy="2865120"/>
                     </a:xfrm>
                     <a:prstGeom prst="rect">
                       <a:avLst/>
@@ -3517,6 +3455,7 @@
           <w:color w:val="212121"/>
           <w:sz w:val="24"/>
         </w:rPr>
+        <w:lastRenderedPageBreak/>
         <w:t xml:space="preserve">3.Replacing with the Mean: </w:t>
       </w:r>
     </w:p>
@@ -3573,7 +3512,6 @@
           <w:color w:val="FCC28B"/>
           <w:sz w:val="21"/>
         </w:rPr>
-        <w:lastRenderedPageBreak/>
         <w:drawing>
           <wp:inline distT="0" distB="0" distL="0" distR="0" wp14:anchorId="767FD576" wp14:editId="212D0296">
             <wp:extent cx="6123940" cy="3690620"/>
@@ -3668,9 +3606,9 @@
           <w:sz w:val="21"/>
         </w:rPr>
         <w:drawing>
-          <wp:inline distT="0" distB="0" distL="0" distR="0" wp14:anchorId="512B34C6" wp14:editId="49F1990E">
-            <wp:extent cx="6123940" cy="3672205"/>
-            <wp:effectExtent l="0" t="0" r="0" b="4445"/>
+          <wp:inline distT="0" distB="0" distL="0" distR="0" wp14:anchorId="512B34C6" wp14:editId="6AF907BF">
+            <wp:extent cx="6123940" cy="3055620"/>
+            <wp:effectExtent l="0" t="0" r="0" b="0"/>
             <wp:docPr id="1790940514" name="Picture 1"/>
             <wp:cNvGraphicFramePr>
               <a:graphicFrameLocks xmlns:a="http://schemas.openxmlformats.org/drawingml/2006/main" noChangeAspect="1"/>
@@ -3691,7 +3629,7 @@
                   <pic:spPr>
                     <a:xfrm>
                       <a:off x="0" y="0"/>
-                      <a:ext cx="6123940" cy="3672205"/>
+                      <a:ext cx="6123940" cy="3055620"/>
                     </a:xfrm>
                     <a:prstGeom prst="rect">
                       <a:avLst/>
@@ -3724,6 +3662,7 @@
           <w:color w:val="212121"/>
           <w:sz w:val="24"/>
         </w:rPr>
+        <w:lastRenderedPageBreak/>
         <w:t xml:space="preserve">5.Replacing with the Median: </w:t>
       </w:r>
     </w:p>
@@ -3739,7 +3678,6 @@
           <w:color w:val="212121"/>
           <w:sz w:val="24"/>
         </w:rPr>
-        <w:lastRenderedPageBreak/>
         <w:t xml:space="preserve">The median is the middlemost value. It’s better to use the median value for imputation in </w:t>
       </w:r>
     </w:p>
@@ -3892,8 +3830,8 @@
           <w:noProof/>
         </w:rPr>
         <w:drawing>
-          <wp:inline distT="0" distB="0" distL="0" distR="0" wp14:anchorId="6714E88E" wp14:editId="1FF4ECA8">
-            <wp:extent cx="6123940" cy="3082290"/>
+          <wp:inline distT="0" distB="0" distL="0" distR="0" wp14:anchorId="6714E88E" wp14:editId="0E5AE12F">
+            <wp:extent cx="6123940" cy="2872740"/>
             <wp:effectExtent l="0" t="0" r="0" b="3810"/>
             <wp:docPr id="611684596" name="Picture 1"/>
             <wp:cNvGraphicFramePr>
@@ -3915,7 +3853,7 @@
                   <pic:spPr>
                     <a:xfrm>
                       <a:off x="0" y="0"/>
-                      <a:ext cx="6123940" cy="3082290"/>
+                      <a:ext cx="6123940" cy="2872740"/>
                     </a:xfrm>
                     <a:prstGeom prst="rect">
                       <a:avLst/>
@@ -4465,152 +4403,6 @@
         </w:rPr>
         <w:t xml:space="preserve"> </w:t>
       </w:r>
-    </w:p>
-    <w:p>
-      <w:pPr>
-        <w:spacing w:after="16"/>
-      </w:pPr>
-      <w:r>
-        <w:rPr>
-          <w:rFonts w:ascii="Times New Roman" w:eastAsia="Times New Roman" w:hAnsi="Times New Roman" w:cs="Times New Roman"/>
-          <w:b/>
-          <w:color w:val="212121"/>
-          <w:sz w:val="24"/>
-        </w:rPr>
-        <w:t xml:space="preserve"> </w:t>
-      </w:r>
-    </w:p>
-    <w:p>
-      <w:pPr>
-        <w:spacing w:after="16"/>
-      </w:pPr>
-      <w:r>
-        <w:rPr>
-          <w:rFonts w:ascii="Times New Roman" w:eastAsia="Times New Roman" w:hAnsi="Times New Roman" w:cs="Times New Roman"/>
-          <w:b/>
-          <w:color w:val="212121"/>
-          <w:sz w:val="24"/>
-        </w:rPr>
-        <w:t xml:space="preserve"> </w:t>
-      </w:r>
-    </w:p>
-    <w:p>
-      <w:pPr>
-        <w:spacing w:after="16"/>
-      </w:pPr>
-      <w:r>
-        <w:rPr>
-          <w:rFonts w:ascii="Times New Roman" w:eastAsia="Times New Roman" w:hAnsi="Times New Roman" w:cs="Times New Roman"/>
-          <w:b/>
-          <w:color w:val="212121"/>
-          <w:sz w:val="24"/>
-        </w:rPr>
-        <w:t xml:space="preserve"> </w:t>
-      </w:r>
-    </w:p>
-    <w:p>
-      <w:pPr>
-        <w:spacing w:after="16"/>
-      </w:pPr>
-      <w:r>
-        <w:rPr>
-          <w:rFonts w:ascii="Times New Roman" w:eastAsia="Times New Roman" w:hAnsi="Times New Roman" w:cs="Times New Roman"/>
-          <w:b/>
-          <w:color w:val="212121"/>
-          <w:sz w:val="24"/>
-        </w:rPr>
-        <w:t xml:space="preserve"> </w:t>
-      </w:r>
-    </w:p>
-    <w:p>
-      <w:pPr>
-        <w:spacing w:after="16"/>
-      </w:pPr>
-      <w:r>
-        <w:rPr>
-          <w:rFonts w:ascii="Times New Roman" w:eastAsia="Times New Roman" w:hAnsi="Times New Roman" w:cs="Times New Roman"/>
-          <w:b/>
-          <w:color w:val="212121"/>
-          <w:sz w:val="24"/>
-        </w:rPr>
-        <w:t xml:space="preserve"> </w:t>
-      </w:r>
-    </w:p>
-    <w:p>
-      <w:pPr>
-        <w:spacing w:after="16"/>
-      </w:pPr>
-      <w:r>
-        <w:rPr>
-          <w:rFonts w:ascii="Times New Roman" w:eastAsia="Times New Roman" w:hAnsi="Times New Roman" w:cs="Times New Roman"/>
-          <w:b/>
-          <w:color w:val="212121"/>
-          <w:sz w:val="24"/>
-        </w:rPr>
-        <w:t xml:space="preserve"> </w:t>
-      </w:r>
-    </w:p>
-    <w:p>
-      <w:pPr>
-        <w:spacing w:after="21"/>
-      </w:pPr>
-      <w:r>
-        <w:rPr>
-          <w:rFonts w:ascii="Times New Roman" w:eastAsia="Times New Roman" w:hAnsi="Times New Roman" w:cs="Times New Roman"/>
-          <w:b/>
-          <w:color w:val="212121"/>
-          <w:sz w:val="24"/>
-        </w:rPr>
-        <w:t xml:space="preserve"> </w:t>
-      </w:r>
-    </w:p>
-    <w:p>
-      <w:pPr>
-        <w:spacing w:after="16"/>
-      </w:pPr>
-      <w:r>
-        <w:rPr>
-          <w:rFonts w:ascii="Times New Roman" w:eastAsia="Times New Roman" w:hAnsi="Times New Roman" w:cs="Times New Roman"/>
-          <w:b/>
-          <w:color w:val="212121"/>
-          <w:sz w:val="24"/>
-        </w:rPr>
-        <w:t xml:space="preserve"> </w:t>
-      </w:r>
-    </w:p>
-    <w:p>
-      <w:pPr>
-        <w:spacing w:after="16"/>
-      </w:pPr>
-      <w:r>
-        <w:rPr>
-          <w:rFonts w:ascii="Times New Roman" w:eastAsia="Times New Roman" w:hAnsi="Times New Roman" w:cs="Times New Roman"/>
-          <w:b/>
-          <w:color w:val="212121"/>
-          <w:sz w:val="24"/>
-        </w:rPr>
-        <w:t xml:space="preserve"> </w:t>
-      </w:r>
-    </w:p>
-    <w:p>
-      <w:pPr>
-        <w:spacing w:after="0"/>
-      </w:pPr>
-      <w:r>
-        <w:rPr>
-          <w:rFonts w:ascii="Times New Roman" w:eastAsia="Times New Roman" w:hAnsi="Times New Roman" w:cs="Times New Roman"/>
-          <w:b/>
-          <w:color w:val="212121"/>
-          <w:sz w:val="24"/>
-        </w:rPr>
-        <w:t xml:space="preserve"> </w:t>
-      </w:r>
-    </w:p>
-    <w:p>
-      <w:pPr>
-        <w:spacing w:after="0"/>
-        <w:ind w:left="284"/>
-      </w:pPr>
       <w:r>
         <w:rPr>
           <w:rFonts w:ascii="Times New Roman" w:eastAsia="Times New Roman" w:hAnsi="Times New Roman" w:cs="Times New Roman"/>
@@ -5094,7 +4886,6 @@
           <w:color w:val="212121"/>
           <w:sz w:val="24"/>
         </w:rPr>
-        <w:lastRenderedPageBreak/>
         <w:t>2.</w:t>
       </w:r>
       <w:r>
@@ -5257,6 +5048,7 @@
           <w:color w:val="212121"/>
           <w:sz w:val="24"/>
         </w:rPr>
+        <w:lastRenderedPageBreak/>
         <w:t xml:space="preserve">Normalization also helps to reduce the impact of outliers and improve the accuracy and stability of statistical models. </w:t>
       </w:r>
     </w:p>
@@ -5425,6 +5217,831 @@
       <w:pPr>
         <w:spacing w:after="0"/>
         <w:ind w:left="294" w:hanging="10"/>
+        <w:rPr>
+          <w:rFonts w:ascii="Times New Roman" w:eastAsia="Times New Roman" w:hAnsi="Times New Roman" w:cs="Times New Roman"/>
+          <w:b/>
+          <w:color w:val="212121"/>
+          <w:sz w:val="24"/>
+        </w:rPr>
+      </w:pPr>
+    </w:p>
+    <w:p>
+      <w:pPr>
+        <w:spacing w:after="0"/>
+        <w:ind w:left="294" w:hanging="10"/>
+        <w:rPr>
+          <w:rFonts w:ascii="Times New Roman" w:eastAsia="Times New Roman" w:hAnsi="Times New Roman" w:cs="Times New Roman"/>
+          <w:bCs/>
+          <w:color w:val="212121"/>
+          <w:sz w:val="24"/>
+        </w:rPr>
+      </w:pPr>
+      <w:r>
+        <w:rPr>
+          <w:rFonts w:ascii="Times New Roman" w:eastAsia="Times New Roman" w:hAnsi="Times New Roman" w:cs="Times New Roman"/>
+          <w:b/>
+          <w:color w:val="212121"/>
+          <w:sz w:val="24"/>
+        </w:rPr>
+        <w:t>10. Histogram</w:t>
+      </w:r>
+      <w:r>
+        <w:rPr>
+          <w:rFonts w:ascii="Times New Roman" w:eastAsia="Times New Roman" w:hAnsi="Times New Roman" w:cs="Times New Roman"/>
+          <w:b/>
+          <w:color w:val="212121"/>
+          <w:sz w:val="24"/>
+        </w:rPr>
+        <w:t>:</w:t>
+      </w:r>
+      <w:r>
+        <w:t xml:space="preserve"> </w:t>
+      </w:r>
+      <w:r>
+        <w:rPr>
+          <w:rFonts w:ascii="Times New Roman" w:eastAsia="Times New Roman" w:hAnsi="Times New Roman" w:cs="Times New Roman"/>
+          <w:bCs/>
+          <w:color w:val="212121"/>
+          <w:sz w:val="24"/>
+        </w:rPr>
+        <w:t xml:space="preserve">Univariate Analysis </w:t>
+      </w:r>
+    </w:p>
+    <w:p>
+      <w:pPr>
+        <w:spacing w:after="0"/>
+        <w:ind w:left="294" w:hanging="10"/>
+        <w:rPr>
+          <w:rFonts w:ascii="Times New Roman" w:eastAsia="Times New Roman" w:hAnsi="Times New Roman" w:cs="Times New Roman"/>
+          <w:bCs/>
+          <w:color w:val="212121"/>
+          <w:sz w:val="24"/>
+        </w:rPr>
+      </w:pPr>
+      <w:r>
+        <w:rPr>
+          <w:rFonts w:ascii="Times New Roman" w:eastAsia="Times New Roman" w:hAnsi="Times New Roman" w:cs="Times New Roman"/>
+          <w:bCs/>
+          <w:color w:val="212121"/>
+          <w:sz w:val="24"/>
+        </w:rPr>
+        <w:t>A Histogram shows how data values are distributed across the dataset. We used it to understand the distribution of Units Sold</w:t>
+      </w:r>
+    </w:p>
+    <w:p>
+      <w:pPr>
+        <w:spacing w:after="0"/>
+        <w:ind w:left="294" w:hanging="10"/>
+        <w:rPr>
+          <w:rFonts w:ascii="Times New Roman" w:eastAsia="Times New Roman" w:hAnsi="Times New Roman" w:cs="Times New Roman"/>
+          <w:bCs/>
+          <w:color w:val="212121"/>
+          <w:sz w:val="24"/>
+        </w:rPr>
+      </w:pPr>
+      <w:r>
+        <w:rPr>
+          <w:rFonts w:ascii="Times New Roman" w:eastAsia="Times New Roman" w:hAnsi="Times New Roman" w:cs="Times New Roman"/>
+          <w:bCs/>
+          <w:color w:val="212121"/>
+          <w:sz w:val="24"/>
+        </w:rPr>
+        <w:drawing>
+          <wp:inline distT="0" distB="0" distL="0" distR="0" wp14:anchorId="71DB11E2" wp14:editId="4E023AD3">
+            <wp:extent cx="6123940" cy="1426845"/>
+            <wp:effectExtent l="0" t="0" r="0" b="1905"/>
+            <wp:docPr id="1300797305" name="Picture 1"/>
+            <wp:cNvGraphicFramePr>
+              <a:graphicFrameLocks xmlns:a="http://schemas.openxmlformats.org/drawingml/2006/main" noChangeAspect="1"/>
+            </wp:cNvGraphicFramePr>
+            <a:graphic xmlns:a="http://schemas.openxmlformats.org/drawingml/2006/main">
+              <a:graphicData uri="http://schemas.openxmlformats.org/drawingml/2006/picture">
+                <pic:pic xmlns:pic="http://schemas.openxmlformats.org/drawingml/2006/picture">
+                  <pic:nvPicPr>
+                    <pic:cNvPr id="1300797305" name=""/>
+                    <pic:cNvPicPr/>
+                  </pic:nvPicPr>
+                  <pic:blipFill>
+                    <a:blip r:embed="rId46"/>
+                    <a:stretch>
+                      <a:fillRect/>
+                    </a:stretch>
+                  </pic:blipFill>
+                  <pic:spPr>
+                    <a:xfrm>
+                      <a:off x="0" y="0"/>
+                      <a:ext cx="6123940" cy="1426845"/>
+                    </a:xfrm>
+                    <a:prstGeom prst="rect">
+                      <a:avLst/>
+                    </a:prstGeom>
+                  </pic:spPr>
+                </pic:pic>
+              </a:graphicData>
+            </a:graphic>
+          </wp:inline>
+        </w:drawing>
+      </w:r>
+    </w:p>
+    <w:p>
+      <w:pPr>
+        <w:spacing w:after="0"/>
+        <w:ind w:left="294" w:hanging="10"/>
+        <w:rPr>
+          <w:rFonts w:ascii="Times New Roman" w:eastAsia="Times New Roman" w:hAnsi="Times New Roman" w:cs="Times New Roman"/>
+          <w:b/>
+          <w:color w:val="212121"/>
+          <w:sz w:val="24"/>
+        </w:rPr>
+      </w:pPr>
+      <w:r>
+        <w:rPr>
+          <w:rFonts w:ascii="Times New Roman" w:eastAsia="Times New Roman" w:hAnsi="Times New Roman" w:cs="Times New Roman"/>
+          <w:b/>
+          <w:color w:val="212121"/>
+          <w:sz w:val="24"/>
+        </w:rPr>
+        <w:lastRenderedPageBreak/>
+        <w:drawing>
+          <wp:inline distT="0" distB="0" distL="0" distR="0" wp14:anchorId="167C94B0" wp14:editId="2BCE4DA6">
+            <wp:extent cx="6123940" cy="3665855"/>
+            <wp:effectExtent l="0" t="0" r="0" b="0"/>
+            <wp:docPr id="2063421294" name="Picture 1"/>
+            <wp:cNvGraphicFramePr>
+              <a:graphicFrameLocks xmlns:a="http://schemas.openxmlformats.org/drawingml/2006/main" noChangeAspect="1"/>
+            </wp:cNvGraphicFramePr>
+            <a:graphic xmlns:a="http://schemas.openxmlformats.org/drawingml/2006/main">
+              <a:graphicData uri="http://schemas.openxmlformats.org/drawingml/2006/picture">
+                <pic:pic xmlns:pic="http://schemas.openxmlformats.org/drawingml/2006/picture">
+                  <pic:nvPicPr>
+                    <pic:cNvPr id="2063421294" name=""/>
+                    <pic:cNvPicPr/>
+                  </pic:nvPicPr>
+                  <pic:blipFill>
+                    <a:blip r:embed="rId47"/>
+                    <a:stretch>
+                      <a:fillRect/>
+                    </a:stretch>
+                  </pic:blipFill>
+                  <pic:spPr>
+                    <a:xfrm>
+                      <a:off x="0" y="0"/>
+                      <a:ext cx="6123940" cy="3665855"/>
+                    </a:xfrm>
+                    <a:prstGeom prst="rect">
+                      <a:avLst/>
+                    </a:prstGeom>
+                  </pic:spPr>
+                </pic:pic>
+              </a:graphicData>
+            </a:graphic>
+          </wp:inline>
+        </w:drawing>
+      </w:r>
+    </w:p>
+    <w:p>
+      <w:pPr>
+        <w:spacing w:after="0"/>
+        <w:ind w:left="294" w:hanging="10"/>
+        <w:rPr>
+          <w:rFonts w:ascii="Times New Roman" w:eastAsia="Times New Roman" w:hAnsi="Times New Roman" w:cs="Times New Roman"/>
+          <w:b/>
+          <w:color w:val="212121"/>
+          <w:sz w:val="24"/>
+        </w:rPr>
+      </w:pPr>
+    </w:p>
+    <w:p>
+      <w:pPr>
+        <w:spacing w:after="0"/>
+        <w:ind w:left="294" w:hanging="10"/>
+        <w:rPr>
+          <w:rFonts w:ascii="Times New Roman" w:eastAsia="Times New Roman" w:hAnsi="Times New Roman" w:cs="Times New Roman"/>
+          <w:bCs/>
+          <w:color w:val="212121"/>
+          <w:sz w:val="24"/>
+        </w:rPr>
+      </w:pPr>
+      <w:r>
+        <w:rPr>
+          <w:rFonts w:ascii="Times New Roman" w:eastAsia="Times New Roman" w:hAnsi="Times New Roman" w:cs="Times New Roman"/>
+          <w:b/>
+          <w:color w:val="212121"/>
+          <w:sz w:val="24"/>
+        </w:rPr>
+        <w:t>1</w:t>
+      </w:r>
+      <w:r>
+        <w:rPr>
+          <w:rFonts w:ascii="Times New Roman" w:eastAsia="Times New Roman" w:hAnsi="Times New Roman" w:cs="Times New Roman"/>
+          <w:b/>
+          <w:color w:val="212121"/>
+          <w:sz w:val="24"/>
+        </w:rPr>
+        <w:t>1</w:t>
+      </w:r>
+      <w:r>
+        <w:rPr>
+          <w:rFonts w:ascii="Times New Roman" w:eastAsia="Times New Roman" w:hAnsi="Times New Roman" w:cs="Times New Roman"/>
+          <w:b/>
+          <w:color w:val="212121"/>
+          <w:sz w:val="24"/>
+        </w:rPr>
+        <w:t xml:space="preserve">. </w:t>
+      </w:r>
+      <w:r>
+        <w:rPr>
+          <w:rFonts w:ascii="Times New Roman" w:eastAsia="Times New Roman" w:hAnsi="Times New Roman" w:cs="Times New Roman"/>
+          <w:b/>
+          <w:color w:val="212121"/>
+          <w:sz w:val="24"/>
+        </w:rPr>
+        <w:t>Box Plot</w:t>
+      </w:r>
+      <w:r>
+        <w:rPr>
+          <w:rFonts w:ascii="Times New Roman" w:eastAsia="Times New Roman" w:hAnsi="Times New Roman" w:cs="Times New Roman"/>
+          <w:b/>
+          <w:color w:val="212121"/>
+          <w:sz w:val="24"/>
+        </w:rPr>
+        <w:t>:</w:t>
+      </w:r>
+      <w:r>
+        <w:t xml:space="preserve"> </w:t>
+      </w:r>
+      <w:r>
+        <w:rPr>
+          <w:rFonts w:ascii="Times New Roman" w:eastAsia="Times New Roman" w:hAnsi="Times New Roman" w:cs="Times New Roman"/>
+          <w:bCs/>
+          <w:color w:val="212121"/>
+          <w:sz w:val="24"/>
+        </w:rPr>
+        <w:t xml:space="preserve">Bivariate Analysis (Units Sold by Season) </w:t>
+      </w:r>
+    </w:p>
+    <w:p>
+      <w:pPr>
+        <w:spacing w:after="0"/>
+        <w:ind w:left="294" w:hanging="10"/>
+        <w:rPr>
+          <w:rFonts w:ascii="Times New Roman" w:eastAsia="Times New Roman" w:hAnsi="Times New Roman" w:cs="Times New Roman"/>
+          <w:bCs/>
+          <w:color w:val="212121"/>
+          <w:sz w:val="24"/>
+        </w:rPr>
+      </w:pPr>
+      <w:r>
+        <w:rPr>
+          <w:rFonts w:ascii="Times New Roman" w:eastAsia="Times New Roman" w:hAnsi="Times New Roman" w:cs="Times New Roman"/>
+          <w:bCs/>
+          <w:color w:val="212121"/>
+          <w:sz w:val="24"/>
+        </w:rPr>
+        <w:t>A Box Plot helps detect outliers and shows data spread. We plotted Units Sold by Season to understand demand variation across seasons</w:t>
+      </w:r>
+    </w:p>
+    <w:p>
+      <w:pPr>
+        <w:spacing w:after="0"/>
+        <w:ind w:left="294" w:hanging="10"/>
+        <w:rPr>
+          <w:rFonts w:ascii="Times New Roman" w:eastAsia="Times New Roman" w:hAnsi="Times New Roman" w:cs="Times New Roman"/>
+          <w:bCs/>
+          <w:color w:val="212121"/>
+          <w:sz w:val="24"/>
+        </w:rPr>
+      </w:pPr>
+    </w:p>
+    <w:p>
+      <w:pPr>
+        <w:spacing w:after="0"/>
+        <w:ind w:left="294" w:hanging="10"/>
+        <w:rPr>
+          <w:rFonts w:ascii="Times New Roman" w:eastAsia="Times New Roman" w:hAnsi="Times New Roman" w:cs="Times New Roman"/>
+          <w:b/>
+          <w:color w:val="212121"/>
+          <w:sz w:val="24"/>
+        </w:rPr>
+      </w:pPr>
+      <w:r>
+        <w:rPr>
+          <w:rFonts w:ascii="Times New Roman" w:eastAsia="Times New Roman" w:hAnsi="Times New Roman" w:cs="Times New Roman"/>
+          <w:b/>
+          <w:color w:val="212121"/>
+          <w:sz w:val="24"/>
+        </w:rPr>
+        <w:drawing>
+          <wp:inline distT="0" distB="0" distL="0" distR="0" wp14:anchorId="12D5B538" wp14:editId="2C3B38D8">
+            <wp:extent cx="6123940" cy="2895600"/>
+            <wp:effectExtent l="0" t="0" r="0" b="0"/>
+            <wp:docPr id="756302710" name="Picture 1"/>
+            <wp:cNvGraphicFramePr>
+              <a:graphicFrameLocks xmlns:a="http://schemas.openxmlformats.org/drawingml/2006/main" noChangeAspect="1"/>
+            </wp:cNvGraphicFramePr>
+            <a:graphic xmlns:a="http://schemas.openxmlformats.org/drawingml/2006/main">
+              <a:graphicData uri="http://schemas.openxmlformats.org/drawingml/2006/picture">
+                <pic:pic xmlns:pic="http://schemas.openxmlformats.org/drawingml/2006/picture">
+                  <pic:nvPicPr>
+                    <pic:cNvPr id="756302710" name=""/>
+                    <pic:cNvPicPr/>
+                  </pic:nvPicPr>
+                  <pic:blipFill>
+                    <a:blip r:embed="rId48"/>
+                    <a:stretch>
+                      <a:fillRect/>
+                    </a:stretch>
+                  </pic:blipFill>
+                  <pic:spPr>
+                    <a:xfrm>
+                      <a:off x="0" y="0"/>
+                      <a:ext cx="6123940" cy="2895600"/>
+                    </a:xfrm>
+                    <a:prstGeom prst="rect">
+                      <a:avLst/>
+                    </a:prstGeom>
+                  </pic:spPr>
+                </pic:pic>
+              </a:graphicData>
+            </a:graphic>
+          </wp:inline>
+        </w:drawing>
+      </w:r>
+    </w:p>
+    <w:p>
+      <w:pPr>
+        <w:spacing w:after="0"/>
+        <w:ind w:left="294" w:hanging="10"/>
+        <w:rPr>
+          <w:rFonts w:ascii="Times New Roman" w:eastAsia="Times New Roman" w:hAnsi="Times New Roman" w:cs="Times New Roman"/>
+          <w:b/>
+          <w:color w:val="212121"/>
+          <w:sz w:val="24"/>
+        </w:rPr>
+      </w:pPr>
+      <w:r>
+        <w:rPr>
+          <w:rFonts w:ascii="Times New Roman" w:eastAsia="Times New Roman" w:hAnsi="Times New Roman" w:cs="Times New Roman"/>
+          <w:b/>
+          <w:color w:val="212121"/>
+          <w:sz w:val="24"/>
+        </w:rPr>
+        <w:lastRenderedPageBreak/>
+        <w:drawing>
+          <wp:inline distT="0" distB="0" distL="0" distR="0" wp14:anchorId="51536FB8" wp14:editId="7D232790">
+            <wp:extent cx="6123940" cy="3624580"/>
+            <wp:effectExtent l="0" t="0" r="0" b="0"/>
+            <wp:docPr id="1848528793" name="Picture 1"/>
+            <wp:cNvGraphicFramePr>
+              <a:graphicFrameLocks xmlns:a="http://schemas.openxmlformats.org/drawingml/2006/main" noChangeAspect="1"/>
+            </wp:cNvGraphicFramePr>
+            <a:graphic xmlns:a="http://schemas.openxmlformats.org/drawingml/2006/main">
+              <a:graphicData uri="http://schemas.openxmlformats.org/drawingml/2006/picture">
+                <pic:pic xmlns:pic="http://schemas.openxmlformats.org/drawingml/2006/picture">
+                  <pic:nvPicPr>
+                    <pic:cNvPr id="1848528793" name=""/>
+                    <pic:cNvPicPr/>
+                  </pic:nvPicPr>
+                  <pic:blipFill>
+                    <a:blip r:embed="rId49"/>
+                    <a:stretch>
+                      <a:fillRect/>
+                    </a:stretch>
+                  </pic:blipFill>
+                  <pic:spPr>
+                    <a:xfrm>
+                      <a:off x="0" y="0"/>
+                      <a:ext cx="6123940" cy="3624580"/>
+                    </a:xfrm>
+                    <a:prstGeom prst="rect">
+                      <a:avLst/>
+                    </a:prstGeom>
+                  </pic:spPr>
+                </pic:pic>
+              </a:graphicData>
+            </a:graphic>
+          </wp:inline>
+        </w:drawing>
+      </w:r>
+    </w:p>
+    <w:p>
+      <w:pPr>
+        <w:spacing w:after="0"/>
+        <w:ind w:left="294" w:hanging="10"/>
+        <w:rPr>
+          <w:rFonts w:ascii="Times New Roman" w:eastAsia="Times New Roman" w:hAnsi="Times New Roman" w:cs="Times New Roman"/>
+          <w:b/>
+          <w:color w:val="212121"/>
+          <w:sz w:val="24"/>
+        </w:rPr>
+      </w:pPr>
+    </w:p>
+    <w:p>
+      <w:pPr>
+        <w:spacing w:after="0"/>
+        <w:ind w:left="294" w:hanging="10"/>
+        <w:rPr>
+          <w:rFonts w:ascii="Times New Roman" w:eastAsia="Times New Roman" w:hAnsi="Times New Roman" w:cs="Times New Roman"/>
+          <w:bCs/>
+          <w:color w:val="212121"/>
+          <w:sz w:val="24"/>
+        </w:rPr>
+      </w:pPr>
+      <w:r>
+        <w:rPr>
+          <w:rFonts w:ascii="Times New Roman" w:eastAsia="Times New Roman" w:hAnsi="Times New Roman" w:cs="Times New Roman"/>
+          <w:b/>
+          <w:color w:val="212121"/>
+          <w:sz w:val="24"/>
+        </w:rPr>
+        <w:t>1</w:t>
+      </w:r>
+      <w:r>
+        <w:rPr>
+          <w:rFonts w:ascii="Times New Roman" w:eastAsia="Times New Roman" w:hAnsi="Times New Roman" w:cs="Times New Roman"/>
+          <w:b/>
+          <w:color w:val="212121"/>
+          <w:sz w:val="24"/>
+        </w:rPr>
+        <w:t>2</w:t>
+      </w:r>
+      <w:r>
+        <w:rPr>
+          <w:rFonts w:ascii="Times New Roman" w:eastAsia="Times New Roman" w:hAnsi="Times New Roman" w:cs="Times New Roman"/>
+          <w:b/>
+          <w:color w:val="212121"/>
+          <w:sz w:val="24"/>
+        </w:rPr>
+        <w:t xml:space="preserve">. </w:t>
+      </w:r>
+      <w:r>
+        <w:rPr>
+          <w:rFonts w:ascii="Times New Roman" w:eastAsia="Times New Roman" w:hAnsi="Times New Roman" w:cs="Times New Roman"/>
+          <w:b/>
+          <w:color w:val="212121"/>
+          <w:sz w:val="24"/>
+        </w:rPr>
+        <w:t>Bar Graph</w:t>
+      </w:r>
+      <w:r>
+        <w:rPr>
+          <w:rFonts w:ascii="Times New Roman" w:eastAsia="Times New Roman" w:hAnsi="Times New Roman" w:cs="Times New Roman"/>
+          <w:b/>
+          <w:color w:val="212121"/>
+          <w:sz w:val="24"/>
+        </w:rPr>
+        <w:t>:</w:t>
+      </w:r>
+      <w:r>
+        <w:t xml:space="preserve"> </w:t>
+      </w:r>
+      <w:r>
+        <w:rPr>
+          <w:rFonts w:ascii="Times New Roman" w:eastAsia="Times New Roman" w:hAnsi="Times New Roman" w:cs="Times New Roman"/>
+          <w:bCs/>
+          <w:color w:val="212121"/>
+          <w:sz w:val="24"/>
+        </w:rPr>
+        <w:t xml:space="preserve">Bivariate Analysis (Average Units Sold by Season) </w:t>
+      </w:r>
+    </w:p>
+    <w:p>
+      <w:pPr>
+        <w:spacing w:after="0"/>
+        <w:ind w:left="294" w:hanging="10"/>
+        <w:rPr>
+          <w:rFonts w:ascii="Times New Roman" w:eastAsia="Times New Roman" w:hAnsi="Times New Roman" w:cs="Times New Roman"/>
+          <w:b/>
+          <w:color w:val="212121"/>
+          <w:sz w:val="24"/>
+        </w:rPr>
+      </w:pPr>
+      <w:r>
+        <w:rPr>
+          <w:rFonts w:ascii="Times New Roman" w:eastAsia="Times New Roman" w:hAnsi="Times New Roman" w:cs="Times New Roman"/>
+          <w:bCs/>
+          <w:color w:val="212121"/>
+          <w:sz w:val="24"/>
+        </w:rPr>
+        <w:t>A Bar Chart is used for categorical variables to compare average values. We plotted average Units Sold by Season.</w:t>
+      </w:r>
+    </w:p>
+    <w:p>
+      <w:pPr>
+        <w:spacing w:after="0"/>
+        <w:ind w:left="294" w:hanging="10"/>
+        <w:rPr>
+          <w:rFonts w:ascii="Times New Roman" w:eastAsia="Times New Roman" w:hAnsi="Times New Roman" w:cs="Times New Roman"/>
+          <w:b/>
+          <w:color w:val="212121"/>
+          <w:sz w:val="24"/>
+        </w:rPr>
+      </w:pPr>
+      <w:r>
+        <w:rPr>
+          <w:rFonts w:ascii="Times New Roman" w:eastAsia="Times New Roman" w:hAnsi="Times New Roman" w:cs="Times New Roman"/>
+          <w:b/>
+          <w:color w:val="212121"/>
+          <w:sz w:val="24"/>
+        </w:rPr>
+        <w:drawing>
+          <wp:inline distT="0" distB="0" distL="0" distR="0" wp14:anchorId="6B6F5467" wp14:editId="5472624E">
+            <wp:extent cx="6123940" cy="2773680"/>
+            <wp:effectExtent l="0" t="0" r="0" b="7620"/>
+            <wp:docPr id="1553171336" name="Picture 1"/>
+            <wp:cNvGraphicFramePr>
+              <a:graphicFrameLocks xmlns:a="http://schemas.openxmlformats.org/drawingml/2006/main" noChangeAspect="1"/>
+            </wp:cNvGraphicFramePr>
+            <a:graphic xmlns:a="http://schemas.openxmlformats.org/drawingml/2006/main">
+              <a:graphicData uri="http://schemas.openxmlformats.org/drawingml/2006/picture">
+                <pic:pic xmlns:pic="http://schemas.openxmlformats.org/drawingml/2006/picture">
+                  <pic:nvPicPr>
+                    <pic:cNvPr id="1553171336" name=""/>
+                    <pic:cNvPicPr/>
+                  </pic:nvPicPr>
+                  <pic:blipFill>
+                    <a:blip r:embed="rId50"/>
+                    <a:stretch>
+                      <a:fillRect/>
+                    </a:stretch>
+                  </pic:blipFill>
+                  <pic:spPr>
+                    <a:xfrm>
+                      <a:off x="0" y="0"/>
+                      <a:ext cx="6123940" cy="2773680"/>
+                    </a:xfrm>
+                    <a:prstGeom prst="rect">
+                      <a:avLst/>
+                    </a:prstGeom>
+                  </pic:spPr>
+                </pic:pic>
+              </a:graphicData>
+            </a:graphic>
+          </wp:inline>
+        </w:drawing>
+      </w:r>
+    </w:p>
+    <w:p>
+      <w:pPr>
+        <w:spacing w:after="0"/>
+        <w:ind w:left="294" w:hanging="10"/>
+        <w:rPr>
+          <w:rFonts w:ascii="Times New Roman" w:eastAsia="Times New Roman" w:hAnsi="Times New Roman" w:cs="Times New Roman"/>
+          <w:b/>
+          <w:color w:val="212121"/>
+          <w:sz w:val="24"/>
+        </w:rPr>
+      </w:pPr>
+      <w:r>
+        <w:rPr>
+          <w:rFonts w:ascii="Times New Roman" w:eastAsia="Times New Roman" w:hAnsi="Times New Roman" w:cs="Times New Roman"/>
+          <w:b/>
+          <w:color w:val="212121"/>
+          <w:sz w:val="24"/>
+        </w:rPr>
+        <w:lastRenderedPageBreak/>
+        <w:drawing>
+          <wp:inline distT="0" distB="0" distL="0" distR="0" wp14:anchorId="118AE416" wp14:editId="07C959AF">
+            <wp:extent cx="6123940" cy="3724910"/>
+            <wp:effectExtent l="0" t="0" r="0" b="8890"/>
+            <wp:docPr id="1096868560" name="Picture 1"/>
+            <wp:cNvGraphicFramePr>
+              <a:graphicFrameLocks xmlns:a="http://schemas.openxmlformats.org/drawingml/2006/main" noChangeAspect="1"/>
+            </wp:cNvGraphicFramePr>
+            <a:graphic xmlns:a="http://schemas.openxmlformats.org/drawingml/2006/main">
+              <a:graphicData uri="http://schemas.openxmlformats.org/drawingml/2006/picture">
+                <pic:pic xmlns:pic="http://schemas.openxmlformats.org/drawingml/2006/picture">
+                  <pic:nvPicPr>
+                    <pic:cNvPr id="1096868560" name=""/>
+                    <pic:cNvPicPr/>
+                  </pic:nvPicPr>
+                  <pic:blipFill>
+                    <a:blip r:embed="rId51"/>
+                    <a:stretch>
+                      <a:fillRect/>
+                    </a:stretch>
+                  </pic:blipFill>
+                  <pic:spPr>
+                    <a:xfrm>
+                      <a:off x="0" y="0"/>
+                      <a:ext cx="6123940" cy="3724910"/>
+                    </a:xfrm>
+                    <a:prstGeom prst="rect">
+                      <a:avLst/>
+                    </a:prstGeom>
+                  </pic:spPr>
+                </pic:pic>
+              </a:graphicData>
+            </a:graphic>
+          </wp:inline>
+        </w:drawing>
+      </w:r>
+    </w:p>
+    <w:p>
+      <w:pPr>
+        <w:spacing w:after="0"/>
+        <w:ind w:left="294" w:hanging="10"/>
+        <w:rPr>
+          <w:rFonts w:ascii="Times New Roman" w:eastAsia="Times New Roman" w:hAnsi="Times New Roman" w:cs="Times New Roman"/>
+          <w:bCs/>
+          <w:color w:val="212121"/>
+          <w:sz w:val="24"/>
+        </w:rPr>
+      </w:pPr>
+      <w:r>
+        <w:rPr>
+          <w:rFonts w:ascii="Times New Roman" w:eastAsia="Times New Roman" w:hAnsi="Times New Roman" w:cs="Times New Roman"/>
+          <w:b/>
+          <w:color w:val="212121"/>
+          <w:sz w:val="24"/>
+        </w:rPr>
+        <w:t>1</w:t>
+      </w:r>
+      <w:r>
+        <w:rPr>
+          <w:rFonts w:ascii="Times New Roman" w:eastAsia="Times New Roman" w:hAnsi="Times New Roman" w:cs="Times New Roman"/>
+          <w:b/>
+          <w:color w:val="212121"/>
+          <w:sz w:val="24"/>
+        </w:rPr>
+        <w:t>3</w:t>
+      </w:r>
+      <w:r>
+        <w:rPr>
+          <w:rFonts w:ascii="Times New Roman" w:eastAsia="Times New Roman" w:hAnsi="Times New Roman" w:cs="Times New Roman"/>
+          <w:b/>
+          <w:color w:val="212121"/>
+          <w:sz w:val="24"/>
+        </w:rPr>
+        <w:t xml:space="preserve">. </w:t>
+      </w:r>
+      <w:r>
+        <w:rPr>
+          <w:rFonts w:ascii="Times New Roman" w:eastAsia="Times New Roman" w:hAnsi="Times New Roman" w:cs="Times New Roman"/>
+          <w:b/>
+          <w:color w:val="212121"/>
+          <w:sz w:val="24"/>
+        </w:rPr>
+        <w:t>Line</w:t>
+      </w:r>
+      <w:r>
+        <w:rPr>
+          <w:rFonts w:ascii="Times New Roman" w:eastAsia="Times New Roman" w:hAnsi="Times New Roman" w:cs="Times New Roman"/>
+          <w:b/>
+          <w:color w:val="212121"/>
+          <w:sz w:val="24"/>
+        </w:rPr>
+        <w:t xml:space="preserve"> Graph:</w:t>
+      </w:r>
+      <w:r>
+        <w:t xml:space="preserve"> </w:t>
+      </w:r>
+      <w:r>
+        <w:rPr>
+          <w:rFonts w:ascii="Times New Roman" w:eastAsia="Times New Roman" w:hAnsi="Times New Roman" w:cs="Times New Roman"/>
+          <w:bCs/>
+          <w:color w:val="212121"/>
+          <w:sz w:val="24"/>
+        </w:rPr>
+        <w:t>Multivariate Analysis (Units Sold by Season per Location)</w:t>
+      </w:r>
+    </w:p>
+    <w:p>
+      <w:pPr>
+        <w:spacing w:after="0"/>
+        <w:ind w:left="294" w:hanging="10"/>
+        <w:rPr>
+          <w:rFonts w:ascii="Times New Roman" w:eastAsia="Times New Roman" w:hAnsi="Times New Roman" w:cs="Times New Roman"/>
+          <w:bCs/>
+          <w:color w:val="212121"/>
+          <w:sz w:val="24"/>
+        </w:rPr>
+      </w:pPr>
+      <w:r>
+        <w:rPr>
+          <w:rFonts w:ascii="Times New Roman" w:eastAsia="Times New Roman" w:hAnsi="Times New Roman" w:cs="Times New Roman"/>
+          <w:bCs/>
+          <w:color w:val="212121"/>
+          <w:sz w:val="24"/>
+        </w:rPr>
+        <w:t>A Line Graph compares variables across categories to identify trends. We plotted Units Sold trend across seasons for each of the 8 Indian cities.</w:t>
+      </w:r>
+    </w:p>
+    <w:p>
+      <w:pPr>
+        <w:spacing w:after="0"/>
+        <w:ind w:left="294" w:hanging="10"/>
+        <w:rPr>
+          <w:rFonts w:ascii="Times New Roman" w:eastAsia="Times New Roman" w:hAnsi="Times New Roman" w:cs="Times New Roman"/>
+          <w:b/>
+          <w:color w:val="212121"/>
+          <w:sz w:val="24"/>
+        </w:rPr>
+      </w:pPr>
+      <w:r>
+        <w:rPr>
+          <w:rFonts w:ascii="Times New Roman" w:eastAsia="Times New Roman" w:hAnsi="Times New Roman" w:cs="Times New Roman"/>
+          <w:b/>
+          <w:color w:val="212121"/>
+          <w:sz w:val="24"/>
+        </w:rPr>
+        <w:drawing>
+          <wp:inline distT="0" distB="0" distL="0" distR="0" wp14:anchorId="1EB95123" wp14:editId="3168860E">
+            <wp:extent cx="6123940" cy="3451860"/>
+            <wp:effectExtent l="0" t="0" r="0" b="0"/>
+            <wp:docPr id="491383047" name="Picture 1"/>
+            <wp:cNvGraphicFramePr>
+              <a:graphicFrameLocks xmlns:a="http://schemas.openxmlformats.org/drawingml/2006/main" noChangeAspect="1"/>
+            </wp:cNvGraphicFramePr>
+            <a:graphic xmlns:a="http://schemas.openxmlformats.org/drawingml/2006/main">
+              <a:graphicData uri="http://schemas.openxmlformats.org/drawingml/2006/picture">
+                <pic:pic xmlns:pic="http://schemas.openxmlformats.org/drawingml/2006/picture">
+                  <pic:nvPicPr>
+                    <pic:cNvPr id="491383047" name=""/>
+                    <pic:cNvPicPr/>
+                  </pic:nvPicPr>
+                  <pic:blipFill>
+                    <a:blip r:embed="rId52"/>
+                    <a:stretch>
+                      <a:fillRect/>
+                    </a:stretch>
+                  </pic:blipFill>
+                  <pic:spPr>
+                    <a:xfrm>
+                      <a:off x="0" y="0"/>
+                      <a:ext cx="6123940" cy="3451860"/>
+                    </a:xfrm>
+                    <a:prstGeom prst="rect">
+                      <a:avLst/>
+                    </a:prstGeom>
+                  </pic:spPr>
+                </pic:pic>
+              </a:graphicData>
+            </a:graphic>
+          </wp:inline>
+        </w:drawing>
+      </w:r>
+    </w:p>
+    <w:p>
+      <w:pPr>
+        <w:spacing w:after="0"/>
+        <w:ind w:left="294" w:hanging="10"/>
+        <w:rPr>
+          <w:rFonts w:ascii="Times New Roman" w:eastAsia="Times New Roman" w:hAnsi="Times New Roman" w:cs="Times New Roman"/>
+          <w:b/>
+          <w:color w:val="212121"/>
+          <w:sz w:val="24"/>
+        </w:rPr>
+      </w:pPr>
+      <w:r>
+        <w:rPr>
+          <w:rFonts w:ascii="Times New Roman" w:eastAsia="Times New Roman" w:hAnsi="Times New Roman" w:cs="Times New Roman"/>
+          <w:b/>
+          <w:color w:val="212121"/>
+          <w:sz w:val="24"/>
+        </w:rPr>
+        <w:lastRenderedPageBreak/>
+        <w:drawing>
+          <wp:inline distT="0" distB="0" distL="0" distR="0" wp14:anchorId="42C7DF97" wp14:editId="1BBF441E">
+            <wp:extent cx="6123940" cy="3667125"/>
+            <wp:effectExtent l="0" t="0" r="0" b="9525"/>
+            <wp:docPr id="1174779283" name="Picture 1"/>
+            <wp:cNvGraphicFramePr>
+              <a:graphicFrameLocks xmlns:a="http://schemas.openxmlformats.org/drawingml/2006/main" noChangeAspect="1"/>
+            </wp:cNvGraphicFramePr>
+            <a:graphic xmlns:a="http://schemas.openxmlformats.org/drawingml/2006/main">
+              <a:graphicData uri="http://schemas.openxmlformats.org/drawingml/2006/picture">
+                <pic:pic xmlns:pic="http://schemas.openxmlformats.org/drawingml/2006/picture">
+                  <pic:nvPicPr>
+                    <pic:cNvPr id="1174779283" name=""/>
+                    <pic:cNvPicPr/>
+                  </pic:nvPicPr>
+                  <pic:blipFill>
+                    <a:blip r:embed="rId53"/>
+                    <a:stretch>
+                      <a:fillRect/>
+                    </a:stretch>
+                  </pic:blipFill>
+                  <pic:spPr>
+                    <a:xfrm>
+                      <a:off x="0" y="0"/>
+                      <a:ext cx="6123940" cy="3667125"/>
+                    </a:xfrm>
+                    <a:prstGeom prst="rect">
+                      <a:avLst/>
+                    </a:prstGeom>
+                  </pic:spPr>
+                </pic:pic>
+              </a:graphicData>
+            </a:graphic>
+          </wp:inline>
+        </w:drawing>
+      </w:r>
+    </w:p>
+    <w:p>
+      <w:pPr>
+        <w:spacing w:after="0"/>
+        <w:ind w:left="294" w:hanging="10"/>
       </w:pPr>
       <w:r>
         <w:rPr>
@@ -5462,7 +6079,6 @@
           <w:color w:val="212121"/>
           <w:sz w:val="24"/>
         </w:rPr>
-        <w:lastRenderedPageBreak/>
         <w:t xml:space="preserve">Normalization and Standardization are not typically required for </w:t>
       </w:r>
       <w:r>
@@ -5567,12 +6183,12 @@
       </w:r>
     </w:p>
     <w:sectPr>
-      <w:headerReference w:type="even" r:id="rId46"/>
-      <w:headerReference w:type="default" r:id="rId47"/>
-      <w:footerReference w:type="even" r:id="rId48"/>
-      <w:footerReference w:type="default" r:id="rId49"/>
-      <w:headerReference w:type="first" r:id="rId50"/>
-      <w:footerReference w:type="first" r:id="rId51"/>
+      <w:headerReference w:type="even" r:id="rId54"/>
+      <w:headerReference w:type="default" r:id="rId55"/>
+      <w:footerReference w:type="even" r:id="rId56"/>
+      <w:footerReference w:type="default" r:id="rId57"/>
+      <w:headerReference w:type="first" r:id="rId58"/>
+      <w:footerReference w:type="first" r:id="rId59"/>
       <w:pgSz w:w="12240" w:h="15840"/>
       <w:pgMar w:top="1076" w:right="1440" w:bottom="1234" w:left="1156" w:header="480" w:footer="342" w:gutter="0"/>
       <w:cols w:space="720"/>
@@ -9959,7 +10575,6 @@
   <w:style w:type="character" w:default="1" w:styleId="DefaultParagraphFont">
     <w:name w:val="Default Paragraph Font"/>
     <w:uiPriority w:val="1"/>
-    <w:semiHidden/>
     <w:unhideWhenUsed/>
   </w:style>
   <w:style w:type="table" w:default="1" w:styleId="TableNormal">

</xml_diff>